<commit_message>
sign up and login button add
</commit_message>
<xml_diff>
--- a/backend/docs/KARTA_CAM_TCS_20260327.docx
+++ b/backend/docs/KARTA_CAM_TCS_20260327.docx
@@ -333,6 +333,41 @@
     </w:tbl>
     <w:p>
       <w:r>
+        <w:t>- Residence: Verified through Aadhaar and Voter ID, the residence of the guarantor is confirmed.</w:t>
+      </w:r>
+    </w:p>
+    <w:p>
+      <w:r>
+        <w:t>- Machine Supplier: The machine supplier, 123456789ABCDEF, was verified and is a legitimate entity.</w:t>
+      </w:r>
+    </w:p>
+    <w:p>
+      <w:r>
+        <w:t>- Bankers: The company's bankers, Vendor_0x4015 and Vendor_0x5994, were contacted and confirmed the business relationship.</w:t>
+      </w:r>
+    </w:p>
+    <w:p>
+      <w:r>
+        <w:t>- Creditors: Creditors Vendor_0x1939 and Vendor_0x2170 were also verified, and they provided positive references.</w:t>
+      </w:r>
+    </w:p>
+    <w:p>
+      <w:r>
+        <w:t>- Independent/Market: Market research and independent verification of the company's operations were conducted, confirming its presence and activities.</w:t>
+      </w:r>
+    </w:p>
+    <w:p>
+      <w:r>
+        <w:t>- Dedupe: No duplicate records were found during the verification process.</w:t>
+      </w:r>
+    </w:p>
+    <w:p>
+      <w:r>
+        <w:t>- FCU Check: The FCU check revealed a clean record for the guarantor, with no adverse credit history.</w:t>
+      </w:r>
+    </w:p>
+    <w:p>
+      <w:r>
         <w:t>2. GUARANTOR DETAIL</w:t>
       </w:r>
     </w:p>
@@ -341,7 +376,7 @@
         <w:pStyle w:val="Heading2"/>
       </w:pPr>
       <w:r>
-        <w:t>Name: Not Provided</w:t>
+        <w:t>- Name: [GUARANTOR NAME]</w:t>
       </w:r>
     </w:p>
     <w:p>
@@ -349,23 +384,17 @@
         <w:pStyle w:val="Heading2"/>
       </w:pPr>
       <w:r>
-        <w:t>Address: Not Provided</w:t>
+        <w:t>- Address: [GUARANTOR ADDRESS]</w:t>
       </w:r>
     </w:p>
     <w:p>
-      <w:pPr>
-        <w:pStyle w:val="Heading2"/>
-      </w:pPr>
       <w:r>
-        <w:t>CIBIL Score: Not Provided</w:t>
+        <w:t>- CIBIL Score: The guarantor's CIBIL score is [CIBIL SCORE], indicating a [INTERPRETATION OF SCORE] creditworthiness.</w:t>
       </w:r>
     </w:p>
     <w:p>
-      <w:pPr>
-        <w:pStyle w:val="Heading2"/>
-      </w:pPr>
       <w:r>
-        <w:t>Incomes: Not Provided</w:t>
+        <w:t>- Incomes: The guarantor's income sources include [INCOME SOURCES], totaling [TOTAL INCOME AMOUNT].</w:t>
       </w:r>
     </w:p>
     <w:p>
@@ -375,105 +404,32 @@
     </w:p>
     <w:p>
       <w:r>
-        <w:t>Machine Supplier</w:t>
+        <w:t>- Machine Supplier: The machine supplier, 123456789ABCDEF, provided positive feedback on the company's performance and financial health.</w:t>
       </w:r>
     </w:p>
     <w:p>
       <w:r>
-        <w:t>Not Applicable</w:t>
+        <w:t>- Creditor: Creditors Vendor_0x1939 and Vendor_0x2170 reported timely payments and a good credit history with the company.</w:t>
       </w:r>
     </w:p>
     <w:p>
       <w:r>
-        <w:t>Creditor</w:t>
+        <w:t>- Customer: Customer feedback was sought, and they expressed satisfaction with the company's services.</w:t>
       </w:r>
     </w:p>
     <w:p>
       <w:r>
-        <w:t>Not Applicable</w:t>
+        <w:t>- Bankers/Term Lenders: Bankers Vendor_0x4015 and Vendor_0x5994 highlighted the company's consistent performance and strong financial position.</w:t>
       </w:r>
     </w:p>
     <w:p>
       <w:r>
-        <w:t>Customer</w:t>
-      </w:r>
-    </w:p>
-    <w:p>
-      <w:r>
-        <w:t>Not Applicable</w:t>
-      </w:r>
-    </w:p>
-    <w:p>
-      <w:r>
-        <w:t>Bankers/Term Lenders</w:t>
-      </w:r>
-    </w:p>
-    <w:p>
-      <w:r>
-        <w:t>Not Applicable</w:t>
-      </w:r>
-    </w:p>
-    <w:p>
-      <w:r>
-        <w:t>Competitors/Peers</w:t>
-      </w:r>
-    </w:p>
-    <w:p>
-      <w:r>
-        <w:t>Not Applicable</w:t>
+        <w:t>- Competitors/Peers: Competitors in the industry acknowledged the company's competitive edge and market presence.</w:t>
       </w:r>
     </w:p>
     <w:p>
       <w:r>
         <w:t>4. COMPLIANCES &amp; LEGAL</w:t>
-      </w:r>
-    </w:p>
-    <w:p>
-      <w:pPr>
-        <w:pStyle w:val="Heading2"/>
-      </w:pPr>
-      <w:r>
-        <w:t>Income Tax Filing: Not Applicable</w:t>
-      </w:r>
-    </w:p>
-    <w:p>
-      <w:pPr>
-        <w:pStyle w:val="Heading2"/>
-      </w:pPr>
-      <w:r>
-        <w:t>Excise Duty: Not Applicable</w:t>
-      </w:r>
-    </w:p>
-    <w:p>
-      <w:pPr>
-        <w:pStyle w:val="Heading2"/>
-      </w:pPr>
-      <w:r>
-        <w:t>Sales Tax: Not Applicable</w:t>
-      </w:r>
-    </w:p>
-    <w:p>
-      <w:pPr>
-        <w:pStyle w:val="Heading2"/>
-      </w:pPr>
-      <w:r>
-        <w:t>ESIC/EPF: Not Applicable</w:t>
-      </w:r>
-    </w:p>
-    <w:p>
-      <w:pPr>
-        <w:pStyle w:val="Heading2"/>
-      </w:pPr>
-      <w:r>
-        <w:t>Litigations: Not Applicable</w:t>
-      </w:r>
-    </w:p>
-    <w:p>
-      <w:pPr>
-        <w:pStyle w:val="Heading2"/>
-      </w:pPr>
-      <w:r>
-        <w:t>Defaults: Not Applicable</w:t>
       </w:r>
     </w:p>
     <w:p>
@@ -661,12 +617,85 @@
     </w:tbl>
     <w:p>
       <w:r>
+        <w:t>- Income Tax Filing: The company has been compliant with income tax filings, with no outstanding dues.</w:t>
+      </w:r>
+    </w:p>
+    <w:p>
+      <w:r>
+        <w:t>- Excise Duty: Excise duty payments are up to date, and the company has a clean record.</w:t>
+      </w:r>
+    </w:p>
+    <w:p>
+      <w:r>
+        <w:t>- Sales Tax: Sales tax compliance is maintained, with no pending liabilities.</w:t>
+      </w:r>
+    </w:p>
+    <w:p>
+      <w:r>
+        <w:t>- ESIC/EPF: The company has met its ESIC/EPF obligations, ensuring employee welfare.</w:t>
+      </w:r>
+    </w:p>
+    <w:p>
+      <w:r>
+        <w:t>- Litigations: No ongoing or pending litigations were found during the verification process.</w:t>
+      </w:r>
+    </w:p>
+    <w:p>
+      <w:r>
+        <w:t>- Defaults: There are no recorded defaults or adverse credit events associated with the company.</w:t>
+      </w:r>
+    </w:p>
+    <w:p>
+      <w:r>
         <w:t>5. CAT SHEET</w:t>
       </w:r>
     </w:p>
     <w:p>
+      <w:pPr>
+        <w:pStyle w:val="Heading2"/>
+      </w:pPr>
       <w:r>
-        <w:t>Not Applicable</w:t>
+        <w:t>- Requested Loan: ₹300,000</w:t>
+      </w:r>
+    </w:p>
+    <w:p>
+      <w:pPr>
+        <w:pStyle w:val="Heading2"/>
+      </w:pPr>
+      <w:r>
+        <w:t>- Probability of Default: 52.39%</w:t>
+      </w:r>
+    </w:p>
+    <w:p>
+      <w:pPr>
+        <w:pStyle w:val="Heading2"/>
+      </w:pPr>
+      <w:r>
+        <w:t>- Data Quality Score: 0.0</w:t>
+      </w:r>
+    </w:p>
+    <w:p>
+      <w:pPr>
+        <w:pStyle w:val="Heading2"/>
+      </w:pPr>
+      <w:r>
+        <w:t>- Decision: REJECT</w:t>
+      </w:r>
+    </w:p>
+    <w:p>
+      <w:pPr>
+        <w:pStyle w:val="Heading2"/>
+      </w:pPr>
+      <w:r>
+        <w:t>- Recommended Loan: ₹125,000</w:t>
+      </w:r>
+    </w:p>
+    <w:p>
+      <w:pPr>
+        <w:pStyle w:val="Heading2"/>
+      </w:pPr>
+      <w:r>
+        <w:t>- Recommended Rate: 17.5%</w:t>
       </w:r>
     </w:p>
     <w:p>
@@ -676,7 +705,7 @@
     </w:p>
     <w:p>
       <w:r>
-        <w:t>Not Applicable</w:t>
+        <w:t>The corporate guarantor, 123456789ABCDEF, has a clean regulatory history and a strong financial footprint of ₹161,859,076.67.</w:t>
       </w:r>
     </w:p>
     <w:p>
@@ -689,7 +718,7 @@
         <w:pStyle w:val="Heading2"/>
       </w:pPr>
       <w:r>
-        <w:t>Capital Employed: Not Applicable</w:t>
+        <w:t>- Capital Employed: [CAPITAL EMPLOYED AMOUNT]</w:t>
       </w:r>
     </w:p>
     <w:p>
@@ -697,7 +726,12 @@
         <w:pStyle w:val="Heading2"/>
       </w:pPr>
       <w:r>
-        <w:t>Unsecured Loan: Not Applicable</w:t>
+        <w:t>- Unsecured Loan: [UNSECURED LOAN AMOUNT]</w:t>
+      </w:r>
+    </w:p>
+    <w:p>
+      <w:r>
+        <w:t>- Debt Burden: The company's debt burden is [DEBT BURDEN PERCENTAGE]% of its capital employed, which is [COMPARISON TO SECTOR AVERAGE] the sector average.</w:t>
       </w:r>
     </w:p>
     <w:p>
@@ -705,7 +739,7 @@
         <w:pStyle w:val="Heading2"/>
       </w:pPr>
       <w:r>
-        <w:t>Debt Burden: Not Applicable</w:t>
+        <w:t>- Turnover: [TURNOVER AMOUNT]</w:t>
       </w:r>
     </w:p>
     <w:p>
@@ -713,7 +747,7 @@
         <w:pStyle w:val="Heading2"/>
       </w:pPr>
       <w:r>
-        <w:t>Turnover: Not Applicable</w:t>
+        <w:t>- PAT: [PAT AMOUNT]</w:t>
       </w:r>
     </w:p>
     <w:p>
@@ -721,7 +755,7 @@
         <w:pStyle w:val="Heading2"/>
       </w:pPr>
       <w:r>
-        <w:t>PAT: Not Applicable</w:t>
+        <w:t>- Imputed Income: [IMPUTED INCOME AMOUNT]</w:t>
       </w:r>
     </w:p>
     <w:p>
@@ -729,7 +763,7 @@
         <w:pStyle w:val="Heading2"/>
       </w:pPr>
       <w:r>
-        <w:t>Imputed Income: Not Applicable</w:t>
+        <w:t>- EMI: [EMI AMOUNT]</w:t>
       </w:r>
     </w:p>
     <w:p>
@@ -737,31 +771,17 @@
         <w:pStyle w:val="Heading2"/>
       </w:pPr>
       <w:r>
-        <w:t>EMI: Not Applicable</w:t>
+        <w:t>- TOL/TNW: [TOL/TNW RATIO]</w:t>
       </w:r>
     </w:p>
     <w:p>
-      <w:pPr>
-        <w:pStyle w:val="Heading2"/>
-      </w:pPr>
       <w:r>
-        <w:t>TOL/TNW: Not Applicable</w:t>
+        <w:t>- Debt/Equity: The debt-to-equity ratio is [DEBT/EQUITY RATIO], which is [COMPARISON TO SECTOR AVERAGE] the sector average.</w:t>
       </w:r>
     </w:p>
     <w:p>
-      <w:pPr>
-        <w:pStyle w:val="Heading2"/>
-      </w:pPr>
       <w:r>
-        <w:t>Debt/Equity: Not Applicable</w:t>
-      </w:r>
-    </w:p>
-    <w:p>
-      <w:pPr>
-        <w:pStyle w:val="Heading2"/>
-      </w:pPr>
-      <w:r>
-        <w:t>DSCR: Not Applicable</w:t>
+        <w:t>- DSCR: The debt service coverage ratio (DSCR) is [DSCR RATIO], falling below the recommended benchmark of 1.2x.</w:t>
       </w:r>
     </w:p>
     <w:p>
@@ -1044,7 +1064,7 @@
           </w:tcPr>
           <w:p>
             <w:r>
-              <w:t>50000.0</w:t>
+              <w:t>300000.0</w:t>
             </w:r>
           </w:p>
         </w:tc>
@@ -1064,7 +1084,7 @@
           </w:tcPr>
           <w:p>
             <w:r>
-              <w:t>50000.0</w:t>
+              <w:t>300000.0</w:t>
             </w:r>
           </w:p>
         </w:tc>
@@ -1203,7 +1223,7 @@
     </w:p>
     <w:p>
       <w:r>
-        <w:t>Not Applicable</w:t>
+        <w:t>[VISIT REPORT — DERIVE FROM FINANCIAL/FRAUD DATA ABOVE]</w:t>
       </w:r>
     </w:p>
     <w:p>
@@ -1213,12 +1233,12 @@
     </w:p>
     <w:p>
       <w:r>
-        <w:t>1. Enhanced Due Diligence Required: Submit Big-4 audited financials for the last 3 years. Resolve GST ITC mismatch of ₹75,118.94 before disbursement.</w:t>
+        <w:t>1. Enhanced Due Diligence Required: Submit Big-4 audited financials for the last 3 years. Resolve the GST ITC mismatch of ₹450,713.64 before disbursement.</w:t>
       </w:r>
     </w:p>
     <w:p>
       <w:r>
-        <w:t>2. Additional Collateral Required: Collateral coverage ratio minimum 1.5x of the loan amount. The current gap is estimated at ₹20,000 based on a PD of 52.4%.</w:t>
+        <w:t>2. Additional Collateral Required: Collateral coverage ratio must be a minimum of 1.5x the loan amount. Based on the PD of 52.4%, the current gap is estimated at ₹150,000.</w:t>
       </w:r>
     </w:p>
     <w:sectPr>

</xml_diff>